<commit_message>
Use verbatim journalist questions in Domclick answer file
Co-Authored-By: Claude Fable 5 <noreply@anthropic.com>
</commit_message>
<xml_diff>
--- a/ответы/2026-07-15_домклик-встроенный-свет-и-скрытая-подсветка.docx
+++ b/ответы/2026-07-15_домклик-встроенный-свет-и-скрытая-подсветка.docx
@@ -49,7 +49,7 @@
           <w:b/>
           <w:sz w:val="22"/>
         </w:rPr>
-        <w:t>Главный страх при выборе встроенных светодиодных линий и магнитных треков, что делать, когда они перегорят. Придётся ли ломать натяжной или гипсокартонный потолок?</w:t>
+        <w:t>Главный страх людей при выборе ультрасовременных встроенных светодиодных линий и магнитных треков — «что делать, когда они перегорят?». Придется ли ломать натяжной или гипсокартонный потолок, или современные системы позволяют легко заменить диодную плату/модуль?</w:t>
       </w:r>
     </w:p>
     <w:p>
@@ -105,7 +105,7 @@
           <w:b/>
           <w:sz w:val="22"/>
         </w:rPr>
-        <w:t>Скрытый свет, ленты в плинтусах, нишах и карнизах. Каковы технические требования к монтажу и где прятать блоки питания, чтобы к ним оставался доступ?</w:t>
+        <w:t>Сегодня в тренде скрытый свет — светодиодные ленты в плинтусах, нишах и карнизах. Каковы технические требования к их монтажу, и где прятать громоздкие трансформаторы (блоки питания), чтобы к ним оставался доступ в случае поломки?</w:t>
       </w:r>
     </w:p>
     <w:p>
@@ -184,7 +184,7 @@
           <w:b/>
           <w:sz w:val="22"/>
         </w:rPr>
-        <w:t>Если бюджет ограничен, на чём можно сэкономить, а что нельзя покупать дешёвым? И нужен ли умный дом ради света в небольшой квартире, или достаточно проходных выключателей?</w:t>
+        <w:t>Если бюджет на ремонт сильно ограничен, на каких элементах системы освещения можно разумно сэкономить, а что категорически нельзя покупать в дешевом сегменте? Стоит ли вкладываться в полноценную систему умного дома ради управления светом в небольшой однокомнатной или двухкомнатной квартире, или в этом случае проще и надежнее обойтись классическими проходными выключателями?</w:t>
       </w:r>
     </w:p>
     <w:p>
@@ -659,7 +659,7 @@
     <w:link w:val="10"/>
     <w:uiPriority w:val="9"/>
     <w:qFormat/>
-    <w:rsid w:val="00DF261F"/>
+    <w:rsid w:val="005A1C95"/>
     <w:pPr>
       <w:keepNext/>
       <w:keepLines/>
@@ -682,7 +682,7 @@
     <w:semiHidden/>
     <w:unhideWhenUsed/>
     <w:qFormat/>
-    <w:rsid w:val="00DF261F"/>
+    <w:rsid w:val="005A1C95"/>
     <w:pPr>
       <w:keepNext/>
       <w:keepLines/>
@@ -705,7 +705,7 @@
     <w:semiHidden/>
     <w:unhideWhenUsed/>
     <w:qFormat/>
-    <w:rsid w:val="00DF261F"/>
+    <w:rsid w:val="005A1C95"/>
     <w:pPr>
       <w:keepNext/>
       <w:keepLines/>
@@ -728,7 +728,7 @@
     <w:semiHidden/>
     <w:unhideWhenUsed/>
     <w:qFormat/>
-    <w:rsid w:val="00DF261F"/>
+    <w:rsid w:val="005A1C95"/>
     <w:pPr>
       <w:keepNext/>
       <w:keepLines/>
@@ -751,7 +751,7 @@
     <w:semiHidden/>
     <w:unhideWhenUsed/>
     <w:qFormat/>
-    <w:rsid w:val="00DF261F"/>
+    <w:rsid w:val="005A1C95"/>
     <w:pPr>
       <w:keepNext/>
       <w:keepLines/>
@@ -772,7 +772,7 @@
     <w:semiHidden/>
     <w:unhideWhenUsed/>
     <w:qFormat/>
-    <w:rsid w:val="00DF261F"/>
+    <w:rsid w:val="005A1C95"/>
     <w:pPr>
       <w:keepNext/>
       <w:keepLines/>
@@ -795,7 +795,7 @@
     <w:semiHidden/>
     <w:unhideWhenUsed/>
     <w:qFormat/>
-    <w:rsid w:val="00DF261F"/>
+    <w:rsid w:val="005A1C95"/>
     <w:pPr>
       <w:keepNext/>
       <w:keepLines/>
@@ -816,7 +816,7 @@
     <w:semiHidden/>
     <w:unhideWhenUsed/>
     <w:qFormat/>
-    <w:rsid w:val="00DF261F"/>
+    <w:rsid w:val="005A1C95"/>
     <w:pPr>
       <w:keepNext/>
       <w:keepLines/>
@@ -839,7 +839,7 @@
     <w:semiHidden/>
     <w:unhideWhenUsed/>
     <w:qFormat/>
-    <w:rsid w:val="00DF261F"/>
+    <w:rsid w:val="005A1C95"/>
     <w:pPr>
       <w:keepNext/>
       <w:keepLines/>
@@ -883,7 +883,7 @@
     <w:basedOn w:val="a0"/>
     <w:link w:val="1"/>
     <w:uiPriority w:val="9"/>
-    <w:rsid w:val="00DF261F"/>
+    <w:rsid w:val="005A1C95"/>
     <w:rPr>
       <w:rFonts w:asciiTheme="majorHAnsi" w:eastAsiaTheme="majorEastAsia" w:hAnsiTheme="majorHAnsi" w:cstheme="majorBidi"/>
       <w:color w:val="0F4761" w:themeColor="accent1" w:themeShade="BF"/>
@@ -897,7 +897,7 @@
     <w:link w:val="2"/>
     <w:uiPriority w:val="9"/>
     <w:semiHidden/>
-    <w:rsid w:val="00DF261F"/>
+    <w:rsid w:val="005A1C95"/>
     <w:rPr>
       <w:rFonts w:asciiTheme="majorHAnsi" w:eastAsiaTheme="majorEastAsia" w:hAnsiTheme="majorHAnsi" w:cstheme="majorBidi"/>
       <w:color w:val="0F4761" w:themeColor="accent1" w:themeShade="BF"/>
@@ -911,7 +911,7 @@
     <w:link w:val="3"/>
     <w:uiPriority w:val="9"/>
     <w:semiHidden/>
-    <w:rsid w:val="00DF261F"/>
+    <w:rsid w:val="005A1C95"/>
     <w:rPr>
       <w:rFonts w:eastAsiaTheme="majorEastAsia" w:cstheme="majorBidi"/>
       <w:color w:val="0F4761" w:themeColor="accent1" w:themeShade="BF"/>
@@ -925,7 +925,7 @@
     <w:link w:val="4"/>
     <w:uiPriority w:val="9"/>
     <w:semiHidden/>
-    <w:rsid w:val="00DF261F"/>
+    <w:rsid w:val="005A1C95"/>
     <w:rPr>
       <w:rFonts w:eastAsiaTheme="majorEastAsia" w:cstheme="majorBidi"/>
       <w:i/>
@@ -939,7 +939,7 @@
     <w:link w:val="5"/>
     <w:uiPriority w:val="9"/>
     <w:semiHidden/>
-    <w:rsid w:val="00DF261F"/>
+    <w:rsid w:val="005A1C95"/>
     <w:rPr>
       <w:rFonts w:eastAsiaTheme="majorEastAsia" w:cstheme="majorBidi"/>
       <w:color w:val="0F4761" w:themeColor="accent1" w:themeShade="BF"/>
@@ -951,7 +951,7 @@
     <w:link w:val="6"/>
     <w:uiPriority w:val="9"/>
     <w:semiHidden/>
-    <w:rsid w:val="00DF261F"/>
+    <w:rsid w:val="005A1C95"/>
     <w:rPr>
       <w:rFonts w:eastAsiaTheme="majorEastAsia" w:cstheme="majorBidi"/>
       <w:i/>
@@ -965,7 +965,7 @@
     <w:link w:val="7"/>
     <w:uiPriority w:val="9"/>
     <w:semiHidden/>
-    <w:rsid w:val="00DF261F"/>
+    <w:rsid w:val="005A1C95"/>
     <w:rPr>
       <w:rFonts w:eastAsiaTheme="majorEastAsia" w:cstheme="majorBidi"/>
       <w:color w:val="595959" w:themeColor="text1" w:themeTint="A6"/>
@@ -977,7 +977,7 @@
     <w:link w:val="8"/>
     <w:uiPriority w:val="9"/>
     <w:semiHidden/>
-    <w:rsid w:val="00DF261F"/>
+    <w:rsid w:val="005A1C95"/>
     <w:rPr>
       <w:rFonts w:eastAsiaTheme="majorEastAsia" w:cstheme="majorBidi"/>
       <w:i/>
@@ -991,7 +991,7 @@
     <w:link w:val="9"/>
     <w:uiPriority w:val="9"/>
     <w:semiHidden/>
-    <w:rsid w:val="00DF261F"/>
+    <w:rsid w:val="005A1C95"/>
     <w:rPr>
       <w:rFonts w:eastAsiaTheme="majorEastAsia" w:cstheme="majorBidi"/>
       <w:color w:val="272727" w:themeColor="text1" w:themeTint="D8"/>
@@ -1004,7 +1004,7 @@
     <w:link w:val="a4"/>
     <w:uiPriority w:val="10"/>
     <w:qFormat/>
-    <w:rsid w:val="00DF261F"/>
+    <w:rsid w:val="005A1C95"/>
     <w:pPr>
       <w:spacing w:after="80" w:line="240" w:lineRule="auto"/>
       <w:contextualSpacing/>
@@ -1022,7 +1022,7 @@
     <w:basedOn w:val="a0"/>
     <w:link w:val="a3"/>
     <w:uiPriority w:val="10"/>
-    <w:rsid w:val="00DF261F"/>
+    <w:rsid w:val="005A1C95"/>
     <w:rPr>
       <w:rFonts w:asciiTheme="majorHAnsi" w:eastAsiaTheme="majorEastAsia" w:hAnsiTheme="majorHAnsi" w:cstheme="majorBidi"/>
       <w:spacing w:val="-10"/>
@@ -1038,7 +1038,7 @@
     <w:link w:val="a6"/>
     <w:uiPriority w:val="11"/>
     <w:qFormat/>
-    <w:rsid w:val="00DF261F"/>
+    <w:rsid w:val="005A1C95"/>
     <w:pPr>
       <w:numPr>
         <w:ilvl w:val="1"/>
@@ -1057,7 +1057,7 @@
     <w:basedOn w:val="a0"/>
     <w:link w:val="a5"/>
     <w:uiPriority w:val="11"/>
-    <w:rsid w:val="00DF261F"/>
+    <w:rsid w:val="005A1C95"/>
     <w:rPr>
       <w:rFonts w:eastAsiaTheme="majorEastAsia" w:cstheme="majorBidi"/>
       <w:color w:val="595959" w:themeColor="text1" w:themeTint="A6"/>
@@ -1073,7 +1073,7 @@
     <w:link w:val="22"/>
     <w:uiPriority w:val="29"/>
     <w:qFormat/>
-    <w:rsid w:val="00DF261F"/>
+    <w:rsid w:val="005A1C95"/>
     <w:pPr>
       <w:spacing w:before="160"/>
       <w:jc w:val="center"/>
@@ -1089,7 +1089,7 @@
     <w:basedOn w:val="a0"/>
     <w:link w:val="21"/>
     <w:uiPriority w:val="29"/>
-    <w:rsid w:val="00DF261F"/>
+    <w:rsid w:val="005A1C95"/>
     <w:rPr>
       <w:i/>
       <w:iCs/>
@@ -1101,7 +1101,7 @@
     <w:basedOn w:val="a"/>
     <w:uiPriority w:val="34"/>
     <w:qFormat/>
-    <w:rsid w:val="00DF261F"/>
+    <w:rsid w:val="005A1C95"/>
     <w:pPr>
       <w:ind w:left="720"/>
       <w:contextualSpacing/>
@@ -1112,7 +1112,7 @@
     <w:basedOn w:val="a0"/>
     <w:uiPriority w:val="21"/>
     <w:qFormat/>
-    <w:rsid w:val="00DF261F"/>
+    <w:rsid w:val="005A1C95"/>
     <w:rPr>
       <w:i/>
       <w:iCs/>
@@ -1126,7 +1126,7 @@
     <w:link w:val="aa"/>
     <w:uiPriority w:val="30"/>
     <w:qFormat/>
-    <w:rsid w:val="00DF261F"/>
+    <w:rsid w:val="005A1C95"/>
     <w:pPr>
       <w:pBdr>
         <w:top w:val="single" w:sz="4" w:space="10" w:color="0F4761" w:themeColor="accent1" w:themeShade="BF"/>
@@ -1147,7 +1147,7 @@
     <w:basedOn w:val="a0"/>
     <w:link w:val="a9"/>
     <w:uiPriority w:val="30"/>
-    <w:rsid w:val="00DF261F"/>
+    <w:rsid w:val="005A1C95"/>
     <w:rPr>
       <w:i/>
       <w:iCs/>
@@ -1159,7 +1159,7 @@
     <w:basedOn w:val="a0"/>
     <w:uiPriority w:val="32"/>
     <w:qFormat/>
-    <w:rsid w:val="00DF261F"/>
+    <w:rsid w:val="005A1C95"/>
     <w:rPr>
       <w:b/>
       <w:bCs/>

</xml_diff>